<commit_message>
Reprice subscription to $39/1st yr, $49/yr renewal, $5/mo
Replaces the flat $17.95/yr figure (and the $23.95/yr renewal/$2.95/mo
split introduced 2026-08-24/25/27) across SubscriptionPanels.tsx, the
landing page, three hand-synced mockups, the sales one-pager, the
Project Instructions reference, and the PRD docx (16 live mentions
updated, the §6.2.3 revenue table rescaled to match, a new v12.11
Schedule A entry added, historical decision records left untouched).

Co-Authored-By: Claude Sonnet 5 <noreply@anthropic.com>
</commit_message>
<xml_diff>
--- a/docs/WouldYouPlease_PRD_v12_10.docx
+++ b/docs/WouldYouPlease_PRD_v12_10.docx
@@ -2305,7 +2305,7 @@
         <w:spacing w:after="120"/>
       </w:pPr>
       <w:r>
-        <w:t>The product is monetized via freemium: a free ad-supported tier (1-year data retention) and a paid annual subscription ($17.95/year — under a nickel a day — ad-free, perpetual retention), with a 60-day free trial of the paid tier for all new users (v7.0). During the pilot, ads are served via Google AdSense (web) and payments via Stripe web checkout; AdMob and mobile in-app billing are added with the native apps in Phase 1. Free-tier ads are deferred for early users (Section 6.1). The system is designed to scale to 1,000,000+ users and is architected for future multi-language and international expansion. A per-phase AWS cost and revenue estimate validating the model appears in Section 6.2.</w:t>
+        <w:t>The product is monetized via freemium: a free ad-supported tier (1-year data retention) and a paid annual subscription ($39 for the first year — a 20% discount — $49/year thereafter, about a dime a day — ad-free, perpetual retention), with a 60-day free trial of the paid tier for all new users (v7.0). During the pilot, ads are served via Google AdSense (web) and payments via Stripe web checkout; AdMob and mobile in-app billing are added with the native apps in Phase 1. Free-tier ads are deferred for early users (Section 6.1). The system is designed to scale to 1,000,000+ users and is architected for future multi-language and international expansion. A per-phase AWS cost and revenue estimate validating the model appears in Section 6.2.</w:t>
       </w:r>
     </w:p>
     <w:p>
@@ -2736,7 +2736,7 @@
           </w:tcPr>
           <w:p>
             <w:r>
-              <w:t>1%+ of active free users upgrade to $17.95/year</w:t>
+              <w:t>1%+ of active free users upgrade to the paid subscription ($39 1st yr / $49/yr thereafter)</w:t>
             </w:r>
           </w:p>
         </w:tc>
@@ -6181,7 +6181,7 @@
           </w:tcPr>
           <w:p>
             <w:r>
-              <w:t>$17.95/year (under a nickel a day)</w:t>
+              <w:t>$39 1st yr (20% discount) / $49/yr thereafter (about a dime a day)</w:t>
             </w:r>
           </w:p>
         </w:tc>
@@ -6840,7 +6840,7 @@
         <w:spacing w:after="120"/>
       </w:pPr>
       <w:r>
-        <w:t>This section validates the $17.95 annual subscription fee and free-tier ad revenue against infrastructure costs at each phase, using the activity volumes from Section 7.2. Figures are planning-level estimates (accuracy roughly plus/minus 50%) based on AWS us-east-1 on-demand pricing as of mid-2026, before AWS Activate startup credits and before reserved-instance/savings-plan discounts. The subscription price was raised to $17.95/year in v8.0 (owner decision), which also resolves the earlier $11.99/$11.95 discrepancy; $17.95 is used throughout.</w:t>
+        <w:t>This section validates the paid subscription fee and free-tier ad revenue against infrastructure costs at each phase, using the activity volumes from Section 7.2. Figures are planning-level estimates (accuracy roughly plus/minus 50%) based on AWS us-east-1 on-demand pricing as of mid-2026, before AWS Activate startup credits and before reserved-instance/savings-plan discounts. The subscription price was raised to $17.95/year in v8.0 (owner decision), which also resolved the earlier $11.99/$11.95 discrepancy; it was raised again in v12.11 to $39 for the first year (a 20% discount) / $49/year on renewal, which is used throughout from that point forward.</w:t>
       </w:r>
     </w:p>
     <w:p>
@@ -8212,7 +8212,7 @@
           </w:tcPr>
           <w:p>
             <w:r>
-              <w:t>Paid subscriptions (1% of users at $17.95/yr)</w:t>
+              <w:t>Paid subscriptions (1% of users at $39 1st yr / $49/yr thereafter)</w:t>
             </w:r>
           </w:p>
         </w:tc>
@@ -8228,7 +8228,7 @@
           </w:tcPr>
           <w:p>
             <w:r>
-              <w:t xml:space="preserve">~$1,800 (100 subs; exit run rate - the 60-day trial defers </w:t>
+              <w:t xml:space="preserve">~$3,900 (100 subs; exit run rate - the 60-day trial defers </w:t>
               <w:lastRenderedPageBreak/>
               <w:t>most in-window receipts)</w:t>
             </w:r>
@@ -8247,7 +8247,7 @@
           <w:p>
             <w:r>
               <w:lastRenderedPageBreak/>
-              <w:t>~$18,000 (1,000 subs)</w:t>
+              <w:t>~$39,000 (1,000 subs)</w:t>
             </w:r>
           </w:p>
         </w:tc>
@@ -8263,7 +8263,7 @@
           </w:tcPr>
           <w:p>
             <w:r>
-              <w:t>~$179,500 (10,000 subs)</w:t>
+              <w:t>~$390,000 (10,000 subs)</w:t>
             </w:r>
           </w:p>
         </w:tc>
@@ -8297,7 +8297,7 @@
           </w:tcPr>
           <w:p>
             <w:r>
-              <w:t>~$1,710</w:t>
+              <w:t>~$3,760</w:t>
             </w:r>
           </w:p>
         </w:tc>
@@ -8313,7 +8313,7 @@
           </w:tcPr>
           <w:p>
             <w:r>
-              <w:t>~$17,100</w:t>
+              <w:t>~$37,600</w:t>
             </w:r>
           </w:p>
         </w:tc>
@@ -8329,7 +8329,7 @@
           </w:tcPr>
           <w:p>
             <w:r>
-              <w:t>~$171,000</w:t>
+              <w:t>~$375,700</w:t>
             </w:r>
           </w:p>
         </w:tc>
@@ -8429,7 +8429,7 @@
           </w:tcPr>
           <w:p>
             <w:r>
-              <w:t>$1,700 - $4,700</w:t>
+              <w:t>$3,800 - $6,800</w:t>
             </w:r>
           </w:p>
         </w:tc>
@@ -8445,7 +8445,7 @@
           </w:tcPr>
           <w:p>
             <w:r>
-              <w:t>$30,000 - $65,000</w:t>
+              <w:t>$50,600 - $85,600</w:t>
             </w:r>
           </w:p>
         </w:tc>
@@ -8461,7 +8461,7 @@
           </w:tcPr>
           <w:p>
             <w:r>
-              <w:t>$386,000 - $776,000</w:t>
+              <w:t>$590,700 - $980,700</w:t>
             </w:r>
           </w:p>
         </w:tc>
@@ -8506,7 +8506,7 @@
         <w:spacing w:after="60"/>
       </w:pPr>
       <w:r>
-        <w:t>At the corrected long-term volumes, infrastructure runs ~$0.10-$0.18 per registered user per year. Subscription revenue at 1% conversion (~$0.18/user/year) alone approaches infrastructure cost; ads and add-on revenue fund margin and non-infrastructure costs (development, support, legal).</w:t>
+        <w:t>At the corrected long-term volumes, infrastructure runs ~$0.10-$0.18 per registered user per year. Subscription revenue at 1% conversion (~$0.40/user/year at the repriced $39/$49 subscription) now clearly exceeds infrastructure cost; ads and add-on revenue fund margin and non-infrastructure costs (development, support, legal).</w:t>
       </w:r>
     </w:p>
     <w:p>
@@ -8519,7 +8519,7 @@
         <w:spacing w:after="60"/>
       </w:pPr>
       <w:r>
-        <w:t xml:space="preserve">Year 1 is approximately breakeven on infrastructure ($23,000-$39,000 cost against $30,000-$65,000 revenue); the model turns clearly positive at scale if the active-share and eCPM assumptions hold, which justifies tracking ad RPM and paid conversion as first-class pilot metrics.</w:t>
+        <w:t xml:space="preserve">Year 1 revenue ($50,600-$85,600) now comfortably exceeds infrastructure cost ($23,000-$39,000) at the repriced $39/$49 subscription; the model turns clearly positive at scale if the active-share and eCPM assumptions hold, which justifies tracking ad RPM and paid conversion as first-class pilot metrics.</w:t>
       </w:r>
     </w:p>
     <w:p>
@@ -8558,7 +8558,7 @@
         <w:spacing w:after="60"/>
       </w:pPr>
       <w:r>
-        <w:t xml:space="preserve">Price validation: $17.95/year works out to under a nickel a day and remains a small fraction of a single Asana or ClickUp seat, so the v8.0 increase carries little competitive risk while lifting subscription revenue ~50% per subscriber; model sustainability still hinges primarily on conversion rate and ad RPM.</w:t>
+        <w:t xml:space="preserve">Price validation: $39 for the first year / $49/year thereafter works out to roughly a dime a day on renewal and remains a small fraction of a single Asana or ClickUp seat, so the v12.11 increase carries little competitive risk while materially lifting subscription revenue per subscriber; model sustainability still hinges primarily on conversion rate and ad RPM.</w:t>
       </w:r>
     </w:p>
     <w:p>
@@ -11321,7 +11321,7 @@
         <w:rPr>
           <w:bCs/>
         </w:rPr>
-        <w:t>Independent of the future add-ons above, a base paid subscription ($17.95/yr) is now defined. It unlocks the two capabilities deferred from the free tier — file attachments and Request Texting (SMS delivery) — plus perpetual retention and an ad-free experience. The Section 9 business-style features remain candidates for optional add-ons layered on top of this base subscription, not part of it. Phase placement and effort are in Sections 10 and 11.</w:t>
+        <w:t>Independent of the future add-ons above, a base paid subscription ($39 for the first year — a 20% discount — $49/year thereafter) is now defined. It unlocks the two capabilities deferred from the free tier — file attachments and Request Texting (SMS delivery) — plus perpetual retention and an ad-free experience. The Section 9 business-style features remain candidates for optional add-ons layered on top of this base subscription, not part of it. Phase placement and effort are in Sections 10 and 11.</w:t>
       </w:r>
     </w:p>
     <w:p>
@@ -12450,7 +12450,7 @@
         <w:t xml:space="preserve">Not yet phased (owner request, 2026-08-15). </w:t>
       </w:r>
       <w:r>
-        <w:t>A subscription feature aimed primarily at business-style usage: reusable text snippets a user can copy into a Request’s Description without retyping common boilerplate (e.g., “In respect to the Overland Warehouse Project: ”). Up to 12 saved phrases, each with an optional Description and a Phrase Text field of up to 150 characters — the same two-field pattern used by a ToDo’s own Locations. Housekeeping gains a Phrases Task, opening a list of saved phrases from which the user can Add Phrase or select an existing one to edit, the same list/detail pattern the Contacts Task already uses. On Create Request, an optional button for each saved phrase appears above and to the right of the Description field; clicking one copies its Phrase Text to the clipboard — the same Copy affordance already used for a ToDo’s own Locations — rather than auto-inserting it, so the user pastes it wherever in the Description they choose. Whether this is included in the base $17.95/yr subscription or layered as a further optional add-on — the treatment given to the other business-style features named in the Monetization direction note above — is not yet decided.</w:t>
+        <w:t>A subscription feature aimed primarily at business-style usage: reusable text snippets a user can copy into a Request’s Description without retyping common boilerplate (e.g., “In respect to the Overland Warehouse Project: ”). Up to 12 saved phrases, each with an optional Description and a Phrase Text field of up to 150 characters — the same two-field pattern used by a ToDo’s own Locations. Housekeeping gains a Phrases Task, opening a list of saved phrases from which the user can Add Phrase or select an existing one to edit, the same list/detail pattern the Contacts Task already uses. On Create Request, an optional button for each saved phrase appears above and to the right of the Description field; clicking one copies its Phrase Text to the clipboard — the same Copy affordance already used for a ToDo’s own Locations — rather than auto-inserting it, so the user pastes it wherever in the Description they choose. Whether this is included in the base subscription or layered as a further optional add-on — the treatment given to the other business-style features named in the Monetization direction note above — is not yet decided.</w:t>
       </w:r>
     </w:p>
     <w:p>
@@ -12646,7 +12646,7 @@
           <w:p>
             <w:r>
               <w:lastRenderedPageBreak/>
-              <w:t xml:space="preserve">Introduce the paid subscription ($17.95/yr): file </w:t>
+              <w:t xml:space="preserve">Introduce the paid subscription ($39 1st yr / $49/yr thereafter): file </w:t>
               <w:lastRenderedPageBreak/>
               <w:t>attachments (Supabase Storage → S3), Request Texting (SMS via Twilio; note 10DLC registration lead time), perpetual retention, ad-free; Stripe checkout. Free-tier ads (AdSense) enabled per the rollout decision (deferred until 200 registered users).</w:t>
             </w:r>
@@ -15796,7 +15796,7 @@
         <w:spacing w:after="120"/>
       </w:pPr>
       <w:r>
-        <w:t xml:space="preserve">Todoist is the closest consumer-grade competitor in the personal productivity segment. It excels at quick task capture, priority levels, recurring tasks, and natural-language input, with a clean cross-platform UI. Its Karma gamification system rewards streaks and task completion. However, Todoist is fundamentally a personal task manager: it has no mechanism to formally send a request to another person and track whether they have responded, accepted, or completed it. Collaboration is limited to assigning tasks within shared projects. There is no threaded dialog (Q&amp;A/comments) on individual tasks in the personal consumer tier, and no formal response workflow. At $4/month Pro or $6/month Business, it is priced well above WYP’s $17.95/year tier (about $1.50/month).</w:t>
+        <w:t xml:space="preserve">Todoist is the closest consumer-grade competitor in the personal productivity segment. It excels at quick task capture, priority levels, recurring tasks, and natural-language input, with a clean cross-platform UI. Its Karma gamification system rewards streaks and task completion. However, Todoist is fundamentally a personal task manager: it has no mechanism to formally send a request to another person and track whether they have responded, accepted, or completed it. Collaboration is limited to assigning tasks within shared projects. There is no threaded dialog (Q&amp;A/comments) on individual tasks in the personal consumer tier, and no formal response workflow. At $4/month Pro or $6/month Business, it is priced well above WYP’s $39/year tier (about $3.25/month for the first year; $49/year, about $4.08/month, thereafter).</w:t>
       </w:r>
     </w:p>
     <w:p>
@@ -15842,7 +15842,7 @@
         <w:t xml:space="preserve">WYP Differentiation: </w:t>
       </w:r>
       <w:r>
-        <w:t>WYP targets individuals and small teams sending requests to any contact (registered or not) with a consumer price of $17.95/year. The secure web response link allows non-registered recipients to respond without installing anything.</w:t>
+        <w:t>WYP targets individuals and small teams sending requests to any contact (registered or not) with a consumer price of $39 for the first year (a 20% discount), $49/year thereafter. The secure web response link allows non-registered recipients to respond without installing anything.</w:t>
       </w:r>
     </w:p>
     <w:p>
@@ -16083,7 +16083,7 @@
       </w:pPr>
       <w:r>
         <w:lastRenderedPageBreak/>
-        <w:t xml:space="preserve">Consumer pricing: $17.95/year flat — under a nickel a day, and a small fraction of the cost of a single Asana or ClickUp seat — with a free ad-supported tier for entry.</w:t>
+        <w:t xml:space="preserve">Consumer pricing: $39 for the first year (a 20% discount) / $49/year thereafter — about a dime a day on renewal, and a small fraction of the cost of a single Asana or ClickUp seat — with a free ad-supported tier for entry.</w:t>
       </w:r>
     </w:p>
     <w:p>
@@ -17756,6 +17756,14 @@
       </w:pPr>
       <w:r>
         <w:t xml:space="preserve">v12.10 §9.6 My Phrases added to the Future Features Roadmap (owner request, 2026-08-15): a subscription feature, primarily for business-style usage, of up to 12 reusable text-snippet phrases (optional Description + up to 150-character Phrase Text, the same two-field pattern as a ToDo’s Locations); a Housekeeping Phrases Task manages the list (same pattern as the Contacts Task), and an optional per-phrase button above and to the right of Create Request’s Description field copies the phrase text to the clipboard — the same Copy affordance as a ToDo’s Locations — rather than auto-inserting it, so the user pastes it wherever they choose. Not yet phased; base-subscription-vs-add-on packaging left open, matching the §9 Monetization direction note.</w:t>
+      </w:r>
+    </w:p>
+    <w:p>
+      <w:pPr>
+        <w:spacing w:after="120"/>
+      </w:pPr>
+      <w:r>
+        <w:t xml:space="preserve">v12.11 Subscription pricing changed (owner decision, 2026-10-13): the flat $17.95/year price used since v8.0 is replaced by a two-tier structure — $39 for the first year (a 20% discount) and $49/year on renewal, plus a $5/month option with no discount as a low-commitment alternative — matching the pricing structure already live in the app since 2026-08-24/25/27, which this PRD had never previously reflected. Every other dollar reference to the subscription price throughout this document (Executive Summary, Section 6 Monetization table, Section 6.2 Cost/Revenue Model and its derived subscriber-revenue figures, Section 9 base subscription, Section 9.6 My Phrases, Section 10 Phased Roadmap, Section 13.2/13.4 competitive profiles) is updated to match; Section 15.1’s own v8.0/v12.0 decision-record rows and this Schedule’s own v8.0/v12.0 entries above are left as written, since they correctly record what was decided at the time. The $5/month figure is the owner’s own direct instruction, not derived from the annual figures. The Section 6.2.3 revenue-table dollar figures are a straightforward proportional rescale to the new $39 headline price, not a full model rebuild — docs/WYP_Hosting_Cost_Crossover_Model.xlsx remains the authoritative cost/revenue workbook and has not been updated in this pass.</w:t>
       </w:r>
     </w:p>
     <w:sectPr>

</xml_diff>